<commit_message>
Se añaden imagenes referenciales en los notebooks de las clases 0 a 5
</commit_message>
<xml_diff>
--- a/ADDPTD/taller-1-limpieza-y-formateo.docx
+++ b/ADDPTD/taller-1-limpieza-y-formateo.docx
@@ -177,14 +177,45 @@
           <w:lang w:eastAsia="es-CO"/>
         </w:rPr>
       </w:pPr>
-      <w:r>
-        <w:rPr>
-          <w:rFonts w:ascii="Candara" w:eastAsia="Times New Roman" w:hAnsi="Candara" w:cs="Times New Roman"/>
-          <w:sz w:val="24"/>
-          <w:szCs w:val="24"/>
-          <w:lang w:eastAsia="es-CO"/>
-        </w:rPr>
-        <w:t xml:space="preserve">GlobalTrade Solutions es una empresa multinacional dedicada a la comercialización de maquinaria industrial. Sus operaciones abarcan </w:t>
+      <w:proofErr w:type="spellStart"/>
+      <w:r>
+        <w:rPr>
+          <w:rFonts w:ascii="Candara" w:eastAsia="Times New Roman" w:hAnsi="Candara" w:cs="Times New Roman"/>
+          <w:sz w:val="24"/>
+          <w:szCs w:val="24"/>
+          <w:lang w:eastAsia="es-CO"/>
+        </w:rPr>
+        <w:t>GlobalTrade</w:t>
+      </w:r>
+      <w:proofErr w:type="spellEnd"/>
+      <w:r>
+        <w:rPr>
+          <w:rFonts w:ascii="Candara" w:eastAsia="Times New Roman" w:hAnsi="Candara" w:cs="Times New Roman"/>
+          <w:sz w:val="24"/>
+          <w:szCs w:val="24"/>
+          <w:lang w:eastAsia="es-CO"/>
+        </w:rPr>
+        <w:t xml:space="preserve"> </w:t>
+      </w:r>
+      <w:proofErr w:type="spellStart"/>
+      <w:r>
+        <w:rPr>
+          <w:rFonts w:ascii="Candara" w:eastAsia="Times New Roman" w:hAnsi="Candara" w:cs="Times New Roman"/>
+          <w:sz w:val="24"/>
+          <w:szCs w:val="24"/>
+          <w:lang w:eastAsia="es-CO"/>
+        </w:rPr>
+        <w:t>Solutions</w:t>
+      </w:r>
+      <w:proofErr w:type="spellEnd"/>
+      <w:r>
+        <w:rPr>
+          <w:rFonts w:ascii="Candara" w:eastAsia="Times New Roman" w:hAnsi="Candara" w:cs="Times New Roman"/>
+          <w:sz w:val="24"/>
+          <w:szCs w:val="24"/>
+          <w:lang w:eastAsia="es-CO"/>
+        </w:rPr>
+        <w:t xml:space="preserve"> es una empresa multinacional dedicada a la comercialización de maquinaria industrial. Sus operaciones abarcan </w:t>
       </w:r>
       <w:r>
         <w:rPr>
@@ -244,7 +275,47 @@
           <w:szCs w:val="24"/>
           <w:lang w:eastAsia="es-CO"/>
         </w:rPr>
-        <w:t>Adicionalmente, GlobalTrade Solutions busca optimizar sus acuerdos comerciales, evaluando la cantidad de tratados de libre comercio que posee cada país y su impacto en los costos de importación y exportación. La dirección financiera también está preocupada por el impacto del tipo de cambio en la rentabilidad de las transacciones internacionales, ya que la volatilidad monetaria podría afectar sus ingresos y costos de operación.</w:t>
+        <w:t xml:space="preserve">Adicionalmente, </w:t>
+      </w:r>
+      <w:proofErr w:type="spellStart"/>
+      <w:r>
+        <w:rPr>
+          <w:rFonts w:ascii="Candara" w:eastAsia="Times New Roman" w:hAnsi="Candara" w:cs="Times New Roman"/>
+          <w:sz w:val="24"/>
+          <w:szCs w:val="24"/>
+          <w:lang w:eastAsia="es-CO"/>
+        </w:rPr>
+        <w:t>GlobalTrade</w:t>
+      </w:r>
+      <w:proofErr w:type="spellEnd"/>
+      <w:r>
+        <w:rPr>
+          <w:rFonts w:ascii="Candara" w:eastAsia="Times New Roman" w:hAnsi="Candara" w:cs="Times New Roman"/>
+          <w:sz w:val="24"/>
+          <w:szCs w:val="24"/>
+          <w:lang w:eastAsia="es-CO"/>
+        </w:rPr>
+        <w:t xml:space="preserve"> </w:t>
+      </w:r>
+      <w:proofErr w:type="spellStart"/>
+      <w:r>
+        <w:rPr>
+          <w:rFonts w:ascii="Candara" w:eastAsia="Times New Roman" w:hAnsi="Candara" w:cs="Times New Roman"/>
+          <w:sz w:val="24"/>
+          <w:szCs w:val="24"/>
+          <w:lang w:eastAsia="es-CO"/>
+        </w:rPr>
+        <w:t>Solutions</w:t>
+      </w:r>
+      <w:proofErr w:type="spellEnd"/>
+      <w:r>
+        <w:rPr>
+          <w:rFonts w:ascii="Candara" w:eastAsia="Times New Roman" w:hAnsi="Candara" w:cs="Times New Roman"/>
+          <w:sz w:val="24"/>
+          <w:szCs w:val="24"/>
+          <w:lang w:eastAsia="es-CO"/>
+        </w:rPr>
+        <w:t xml:space="preserve"> busca optimizar sus acuerdos comerciales, evaluando la cantidad de tratados de libre comercio que posee cada país y su impacto en los costos de importación y exportación. La dirección financiera también está preocupada por el impacto del tipo de cambio en la rentabilidad de las transacciones internacionales, ya que la volatilidad monetaria podría afectar sus ingresos y costos de operación.</w:t>
       </w:r>
     </w:p>
     <w:p>
@@ -267,6 +338,7 @@
         </w:rPr>
         <w:t xml:space="preserve">Ante esta situación, el departamento de inteligencia de negocios de la empresa ha sido asignado para realizar un análisis exhaustivo de los datos económicos recopilados. Para ello, se utilizará </w:t>
       </w:r>
+      <w:proofErr w:type="spellStart"/>
       <w:r>
         <w:rPr>
           <w:rFonts w:ascii="Candara" w:eastAsia="Times New Roman" w:hAnsi="Candara" w:cs="Times New Roman"/>
@@ -276,6 +348,7 @@
         </w:rPr>
         <w:t>Knime</w:t>
       </w:r>
+      <w:proofErr w:type="spellEnd"/>
       <w:r>
         <w:rPr>
           <w:rFonts w:ascii="Candara" w:eastAsia="Times New Roman" w:hAnsi="Candara" w:cs="Times New Roman"/>
@@ -521,15 +594,17 @@
         </w:rPr>
         <w:t xml:space="preserve">Su empresa de </w:t>
       </w:r>
-      <w:r>
-        <w:rPr>
-          <w:rFonts w:ascii="Candara" w:eastAsia="Times New Roman" w:hAnsi="Candara" w:cs="Times New Roman"/>
-          <w:sz w:val="24"/>
-          <w:szCs w:val="24"/>
-          <w:lang w:eastAsia="es-CO"/>
-        </w:rPr>
-        <w:t>business intelligence</w:t>
-      </w:r>
+      <w:proofErr w:type="spellStart"/>
+      <w:r>
+        <w:rPr>
+          <w:rFonts w:ascii="Candara" w:eastAsia="Times New Roman" w:hAnsi="Candara" w:cs="Times New Roman"/>
+          <w:sz w:val="24"/>
+          <w:szCs w:val="24"/>
+          <w:lang w:eastAsia="es-CO"/>
+        </w:rPr>
+        <w:t>business</w:t>
+      </w:r>
+      <w:proofErr w:type="spellEnd"/>
       <w:r>
         <w:rPr>
           <w:rFonts w:ascii="Candara" w:eastAsia="Times New Roman" w:hAnsi="Candara" w:cs="Times New Roman"/>
@@ -539,6 +614,26 @@
         </w:rPr>
         <w:t xml:space="preserve"> </w:t>
       </w:r>
+      <w:proofErr w:type="spellStart"/>
+      <w:r>
+        <w:rPr>
+          <w:rFonts w:ascii="Candara" w:eastAsia="Times New Roman" w:hAnsi="Candara" w:cs="Times New Roman"/>
+          <w:sz w:val="24"/>
+          <w:szCs w:val="24"/>
+          <w:lang w:eastAsia="es-CO"/>
+        </w:rPr>
+        <w:t>intelligence</w:t>
+      </w:r>
+      <w:proofErr w:type="spellEnd"/>
+      <w:r>
+        <w:rPr>
+          <w:rFonts w:ascii="Candara" w:eastAsia="Times New Roman" w:hAnsi="Candara" w:cs="Times New Roman"/>
+          <w:sz w:val="24"/>
+          <w:szCs w:val="24"/>
+          <w:lang w:eastAsia="es-CO"/>
+        </w:rPr>
+        <w:t xml:space="preserve"> </w:t>
+      </w:r>
       <w:r>
         <w:rPr>
           <w:rFonts w:ascii="Candara" w:eastAsia="Times New Roman" w:hAnsi="Candara" w:cs="Times New Roman"/>
@@ -566,6 +661,7 @@
         </w:rPr>
         <w:t xml:space="preserve">Usando </w:t>
       </w:r>
+      <w:proofErr w:type="spellStart"/>
       <w:r>
         <w:rPr>
           <w:rFonts w:ascii="Candara" w:eastAsia="Times New Roman" w:hAnsi="Candara" w:cs="Times New Roman"/>
@@ -575,6 +671,7 @@
         </w:rPr>
         <w:t>Knime</w:t>
       </w:r>
+      <w:proofErr w:type="spellEnd"/>
       <w:r>
         <w:rPr>
           <w:rFonts w:ascii="Candara" w:eastAsia="Times New Roman" w:hAnsi="Candara" w:cs="Times New Roman"/>
@@ -656,6 +753,7 @@
         </w:rPr>
         <w:t xml:space="preserve">a </w:t>
       </w:r>
+      <w:proofErr w:type="spellStart"/>
       <w:r>
         <w:rPr>
           <w:rFonts w:ascii="Candara" w:eastAsia="Times New Roman" w:hAnsi="Candara" w:cs="Times New Roman"/>
@@ -665,6 +763,7 @@
         </w:rPr>
         <w:t>Knime</w:t>
       </w:r>
+      <w:proofErr w:type="spellEnd"/>
       <w:r>
         <w:rPr>
           <w:rFonts w:ascii="Candara" w:eastAsia="Times New Roman" w:hAnsi="Candara" w:cs="Times New Roman"/>
@@ -696,6 +795,61 @@
     <w:p>
       <w:pPr>
         <w:spacing w:before="100" w:beforeAutospacing="1" w:after="100" w:afterAutospacing="1" w:line="240" w:lineRule="auto"/>
+        <w:jc w:val="both"/>
+        <w:rPr>
+          <w:rFonts w:ascii="Candara" w:eastAsia="Times New Roman" w:hAnsi="Candara" w:cs="Times New Roman"/>
+          <w:sz w:val="24"/>
+          <w:szCs w:val="24"/>
+          <w:lang w:eastAsia="es-CO"/>
+        </w:rPr>
+      </w:pPr>
+      <w:r>
+        <w:rPr>
+          <w:rFonts w:ascii="Candara" w:eastAsia="Times New Roman" w:hAnsi="Candara" w:cs="Times New Roman"/>
+          <w:sz w:val="24"/>
+          <w:szCs w:val="24"/>
+          <w:lang w:eastAsia="es-CO"/>
+        </w:rPr>
+        <w:drawing>
+          <wp:inline distT="0" distB="0" distL="0" distR="0" wp14:anchorId="7242BFCE" wp14:editId="596ADD0D">
+            <wp:extent cx="4406869" cy="4489346"/>
+            <wp:effectExtent l="0" t="0" r="0" b="6985"/>
+            <wp:docPr id="333280423" name="Imagen 1"/>
+            <wp:cNvGraphicFramePr>
+              <a:graphicFrameLocks xmlns:a="http://schemas.openxmlformats.org/drawingml/2006/main" noChangeAspect="1"/>
+            </wp:cNvGraphicFramePr>
+            <a:graphic xmlns:a="http://schemas.openxmlformats.org/drawingml/2006/main">
+              <a:graphicData uri="http://schemas.openxmlformats.org/drawingml/2006/picture">
+                <pic:pic xmlns:pic="http://schemas.openxmlformats.org/drawingml/2006/picture">
+                  <pic:nvPicPr>
+                    <pic:cNvPr id="333280423" name=""/>
+                    <pic:cNvPicPr/>
+                  </pic:nvPicPr>
+                  <pic:blipFill>
+                    <a:blip r:embed="rId7"/>
+                    <a:stretch>
+                      <a:fillRect/>
+                    </a:stretch>
+                  </pic:blipFill>
+                  <pic:spPr>
+                    <a:xfrm>
+                      <a:off x="0" y="0"/>
+                      <a:ext cx="4416224" cy="4498876"/>
+                    </a:xfrm>
+                    <a:prstGeom prst="rect">
+                      <a:avLst/>
+                    </a:prstGeom>
+                  </pic:spPr>
+                </pic:pic>
+              </a:graphicData>
+            </a:graphic>
+          </wp:inline>
+        </w:drawing>
+      </w:r>
+    </w:p>
+    <w:p>
+      <w:pPr>
+        <w:spacing w:before="100" w:beforeAutospacing="1" w:after="100" w:afterAutospacing="1" w:line="240" w:lineRule="auto"/>
         <w:ind w:left="720"/>
         <w:jc w:val="both"/>
         <w:rPr>
@@ -705,6 +859,105 @@
           <w:lang w:eastAsia="es-CO"/>
         </w:rPr>
       </w:pPr>
+      <w:r>
+        <w:rPr>
+          <w:rFonts w:ascii="Candara" w:eastAsia="Times New Roman" w:hAnsi="Candara" w:cs="Times New Roman"/>
+          <w:sz w:val="24"/>
+          <w:szCs w:val="24"/>
+          <w:lang w:eastAsia="es-CO"/>
+        </w:rPr>
+        <w:lastRenderedPageBreak/>
+        <w:drawing>
+          <wp:inline distT="0" distB="0" distL="0" distR="0" wp14:anchorId="67E8876E" wp14:editId="23B18EB0">
+            <wp:extent cx="3835501" cy="3551632"/>
+            <wp:effectExtent l="0" t="0" r="0" b="0"/>
+            <wp:docPr id="749258567" name="Imagen 1"/>
+            <wp:cNvGraphicFramePr>
+              <a:graphicFrameLocks xmlns:a="http://schemas.openxmlformats.org/drawingml/2006/main" noChangeAspect="1"/>
+            </wp:cNvGraphicFramePr>
+            <a:graphic xmlns:a="http://schemas.openxmlformats.org/drawingml/2006/main">
+              <a:graphicData uri="http://schemas.openxmlformats.org/drawingml/2006/picture">
+                <pic:pic xmlns:pic="http://schemas.openxmlformats.org/drawingml/2006/picture">
+                  <pic:nvPicPr>
+                    <pic:cNvPr id="749258567" name=""/>
+                    <pic:cNvPicPr/>
+                  </pic:nvPicPr>
+                  <pic:blipFill>
+                    <a:blip r:embed="rId8"/>
+                    <a:stretch>
+                      <a:fillRect/>
+                    </a:stretch>
+                  </pic:blipFill>
+                  <pic:spPr>
+                    <a:xfrm>
+                      <a:off x="0" y="0"/>
+                      <a:ext cx="3837116" cy="3553128"/>
+                    </a:xfrm>
+                    <a:prstGeom prst="rect">
+                      <a:avLst/>
+                    </a:prstGeom>
+                  </pic:spPr>
+                </pic:pic>
+              </a:graphicData>
+            </a:graphic>
+          </wp:inline>
+        </w:drawing>
+      </w:r>
+    </w:p>
+    <w:p>
+      <w:pPr>
+        <w:spacing w:before="100" w:beforeAutospacing="1" w:after="100" w:afterAutospacing="1" w:line="240" w:lineRule="auto"/>
+        <w:ind w:left="720"/>
+        <w:jc w:val="both"/>
+        <w:rPr>
+          <w:rFonts w:ascii="Candara" w:eastAsia="Times New Roman" w:hAnsi="Candara" w:cs="Times New Roman"/>
+          <w:sz w:val="24"/>
+          <w:szCs w:val="24"/>
+          <w:lang w:eastAsia="es-CO"/>
+        </w:rPr>
+      </w:pPr>
+    </w:p>
+    <w:p>
+      <w:pPr>
+        <w:spacing w:before="100" w:beforeAutospacing="1" w:after="100" w:afterAutospacing="1" w:line="240" w:lineRule="auto"/>
+        <w:ind w:left="720"/>
+        <w:jc w:val="both"/>
+        <w:rPr>
+          <w:rFonts w:ascii="Candara" w:eastAsia="Times New Roman" w:hAnsi="Candara" w:cs="Times New Roman"/>
+          <w:sz w:val="24"/>
+          <w:szCs w:val="24"/>
+          <w:lang w:eastAsia="es-CO"/>
+        </w:rPr>
+      </w:pPr>
+      <w:r>
+        <w:rPr>
+          <w:rFonts w:ascii="Candara" w:eastAsia="Times New Roman" w:hAnsi="Candara" w:cs="Times New Roman"/>
+          <w:sz w:val="24"/>
+          <w:szCs w:val="24"/>
+          <w:lang w:eastAsia="es-CO"/>
+        </w:rPr>
+        <w:t xml:space="preserve">De acuerdo con el resultado de </w:t>
+      </w:r>
+      <w:proofErr w:type="spellStart"/>
+      <w:r>
+        <w:rPr>
+          <w:rFonts w:ascii="Candara" w:eastAsia="Times New Roman" w:hAnsi="Candara" w:cs="Times New Roman"/>
+          <w:sz w:val="24"/>
+          <w:szCs w:val="24"/>
+          <w:lang w:eastAsia="es-CO"/>
+        </w:rPr>
+        <w:t>Knime</w:t>
+      </w:r>
+      <w:proofErr w:type="spellEnd"/>
+      <w:r>
+        <w:rPr>
+          <w:rFonts w:ascii="Candara" w:eastAsia="Times New Roman" w:hAnsi="Candara" w:cs="Times New Roman"/>
+          <w:sz w:val="24"/>
+          <w:szCs w:val="24"/>
+          <w:lang w:eastAsia="es-CO"/>
+        </w:rPr>
+        <w:t>, tenemos un total de 220 filas y 10 columnas.</w:t>
+      </w:r>
     </w:p>
     <w:p>
       <w:pPr>
@@ -763,6 +1016,133 @@
           <w:lang w:eastAsia="es-CO"/>
         </w:rPr>
       </w:pPr>
+      <w:r>
+        <w:rPr>
+          <w:rFonts w:ascii="Candara" w:eastAsia="Times New Roman" w:hAnsi="Candara" w:cs="Times New Roman"/>
+          <w:sz w:val="24"/>
+          <w:szCs w:val="24"/>
+          <w:lang w:eastAsia="es-CO"/>
+        </w:rPr>
+        <w:lastRenderedPageBreak/>
+        <w:drawing>
+          <wp:inline distT="0" distB="0" distL="0" distR="0" wp14:anchorId="1F6753E4" wp14:editId="22E25775">
+            <wp:extent cx="5971540" cy="4019550"/>
+            <wp:effectExtent l="0" t="0" r="0" b="0"/>
+            <wp:docPr id="262906409" name="Imagen 1"/>
+            <wp:cNvGraphicFramePr>
+              <a:graphicFrameLocks xmlns:a="http://schemas.openxmlformats.org/drawingml/2006/main" noChangeAspect="1"/>
+            </wp:cNvGraphicFramePr>
+            <a:graphic xmlns:a="http://schemas.openxmlformats.org/drawingml/2006/main">
+              <a:graphicData uri="http://schemas.openxmlformats.org/drawingml/2006/picture">
+                <pic:pic xmlns:pic="http://schemas.openxmlformats.org/drawingml/2006/picture">
+                  <pic:nvPicPr>
+                    <pic:cNvPr id="262906409" name=""/>
+                    <pic:cNvPicPr/>
+                  </pic:nvPicPr>
+                  <pic:blipFill>
+                    <a:blip r:embed="rId9"/>
+                    <a:stretch>
+                      <a:fillRect/>
+                    </a:stretch>
+                  </pic:blipFill>
+                  <pic:spPr>
+                    <a:xfrm>
+                      <a:off x="0" y="0"/>
+                      <a:ext cx="5971540" cy="4019550"/>
+                    </a:xfrm>
+                    <a:prstGeom prst="rect">
+                      <a:avLst/>
+                    </a:prstGeom>
+                  </pic:spPr>
+                </pic:pic>
+              </a:graphicData>
+            </a:graphic>
+          </wp:inline>
+        </w:drawing>
+      </w:r>
+    </w:p>
+    <w:p>
+      <w:pPr>
+        <w:spacing w:before="100" w:beforeAutospacing="1" w:after="100" w:afterAutospacing="1" w:line="240" w:lineRule="auto"/>
+        <w:ind w:left="720"/>
+        <w:jc w:val="both"/>
+        <w:rPr>
+          <w:rFonts w:ascii="Candara" w:eastAsia="Times New Roman" w:hAnsi="Candara" w:cs="Times New Roman"/>
+          <w:sz w:val="24"/>
+          <w:szCs w:val="24"/>
+          <w:lang w:eastAsia="es-CO"/>
+        </w:rPr>
+      </w:pPr>
+    </w:p>
+    <w:p>
+      <w:pPr>
+        <w:spacing w:before="100" w:beforeAutospacing="1" w:after="100" w:afterAutospacing="1" w:line="240" w:lineRule="auto"/>
+        <w:ind w:left="720"/>
+        <w:jc w:val="both"/>
+        <w:rPr>
+          <w:rFonts w:ascii="Candara" w:eastAsia="Times New Roman" w:hAnsi="Candara" w:cs="Times New Roman"/>
+          <w:sz w:val="24"/>
+          <w:szCs w:val="24"/>
+          <w:lang w:eastAsia="es-CO"/>
+        </w:rPr>
+      </w:pPr>
+      <w:r>
+        <w:rPr>
+          <w:rFonts w:ascii="Candara" w:eastAsia="Times New Roman" w:hAnsi="Candara" w:cs="Times New Roman"/>
+          <w:sz w:val="24"/>
+          <w:szCs w:val="24"/>
+          <w:lang w:eastAsia="es-CO"/>
+        </w:rPr>
+        <w:lastRenderedPageBreak/>
+        <w:drawing>
+          <wp:inline distT="0" distB="0" distL="0" distR="0" wp14:anchorId="637535FC" wp14:editId="22A4F7DD">
+            <wp:extent cx="5464013" cy="4762913"/>
+            <wp:effectExtent l="0" t="0" r="3810" b="0"/>
+            <wp:docPr id="1520686141" name="Imagen 1"/>
+            <wp:cNvGraphicFramePr>
+              <a:graphicFrameLocks xmlns:a="http://schemas.openxmlformats.org/drawingml/2006/main" noChangeAspect="1"/>
+            </wp:cNvGraphicFramePr>
+            <a:graphic xmlns:a="http://schemas.openxmlformats.org/drawingml/2006/main">
+              <a:graphicData uri="http://schemas.openxmlformats.org/drawingml/2006/picture">
+                <pic:pic xmlns:pic="http://schemas.openxmlformats.org/drawingml/2006/picture">
+                  <pic:nvPicPr>
+                    <pic:cNvPr id="1520686141" name=""/>
+                    <pic:cNvPicPr/>
+                  </pic:nvPicPr>
+                  <pic:blipFill>
+                    <a:blip r:embed="rId10"/>
+                    <a:stretch>
+                      <a:fillRect/>
+                    </a:stretch>
+                  </pic:blipFill>
+                  <pic:spPr>
+                    <a:xfrm>
+                      <a:off x="0" y="0"/>
+                      <a:ext cx="5464013" cy="4762913"/>
+                    </a:xfrm>
+                    <a:prstGeom prst="rect">
+                      <a:avLst/>
+                    </a:prstGeom>
+                  </pic:spPr>
+                </pic:pic>
+              </a:graphicData>
+            </a:graphic>
+          </wp:inline>
+        </w:drawing>
+      </w:r>
+    </w:p>
+    <w:p>
+      <w:pPr>
+        <w:spacing w:before="100" w:beforeAutospacing="1" w:after="100" w:afterAutospacing="1" w:line="240" w:lineRule="auto"/>
+        <w:ind w:left="720"/>
+        <w:jc w:val="both"/>
+        <w:rPr>
+          <w:rFonts w:ascii="Candara" w:eastAsia="Times New Roman" w:hAnsi="Candara" w:cs="Times New Roman"/>
+          <w:sz w:val="24"/>
+          <w:szCs w:val="24"/>
+          <w:lang w:eastAsia="es-CO"/>
+        </w:rPr>
+      </w:pPr>
     </w:p>
     <w:p>
       <w:pPr>
@@ -820,6 +1200,83 @@
           <w:lang w:eastAsia="es-CO"/>
         </w:rPr>
       </w:pPr>
+      <w:r>
+        <w:rPr>
+          <w:rFonts w:ascii="Candara" w:eastAsia="Times New Roman" w:hAnsi="Candara" w:cs="Times New Roman"/>
+          <w:sz w:val="24"/>
+          <w:szCs w:val="24"/>
+          <w:lang w:eastAsia="es-CO"/>
+        </w:rPr>
+        <w:lastRenderedPageBreak/>
+        <w:drawing>
+          <wp:inline distT="0" distB="0" distL="0" distR="0" wp14:anchorId="7BB58EF2" wp14:editId="242CA6EF">
+            <wp:extent cx="5971540" cy="3091815"/>
+            <wp:effectExtent l="0" t="0" r="0" b="0"/>
+            <wp:docPr id="169999059" name="Imagen 1"/>
+            <wp:cNvGraphicFramePr>
+              <a:graphicFrameLocks xmlns:a="http://schemas.openxmlformats.org/drawingml/2006/main" noChangeAspect="1"/>
+            </wp:cNvGraphicFramePr>
+            <a:graphic xmlns:a="http://schemas.openxmlformats.org/drawingml/2006/main">
+              <a:graphicData uri="http://schemas.openxmlformats.org/drawingml/2006/picture">
+                <pic:pic xmlns:pic="http://schemas.openxmlformats.org/drawingml/2006/picture">
+                  <pic:nvPicPr>
+                    <pic:cNvPr id="169999059" name=""/>
+                    <pic:cNvPicPr/>
+                  </pic:nvPicPr>
+                  <pic:blipFill>
+                    <a:blip r:embed="rId11"/>
+                    <a:stretch>
+                      <a:fillRect/>
+                    </a:stretch>
+                  </pic:blipFill>
+                  <pic:spPr>
+                    <a:xfrm>
+                      <a:off x="0" y="0"/>
+                      <a:ext cx="5971540" cy="3091815"/>
+                    </a:xfrm>
+                    <a:prstGeom prst="rect">
+                      <a:avLst/>
+                    </a:prstGeom>
+                  </pic:spPr>
+                </pic:pic>
+              </a:graphicData>
+            </a:graphic>
+          </wp:inline>
+        </w:drawing>
+      </w:r>
+    </w:p>
+    <w:p>
+      <w:pPr>
+        <w:spacing w:before="100" w:beforeAutospacing="1" w:after="100" w:afterAutospacing="1" w:line="240" w:lineRule="auto"/>
+        <w:jc w:val="both"/>
+        <w:rPr>
+          <w:rFonts w:ascii="Candara" w:eastAsia="Times New Roman" w:hAnsi="Candara" w:cs="Times New Roman"/>
+          <w:sz w:val="24"/>
+          <w:szCs w:val="24"/>
+          <w:lang w:eastAsia="es-CO"/>
+        </w:rPr>
+      </w:pPr>
+    </w:p>
+    <w:p>
+      <w:pPr>
+        <w:spacing w:before="100" w:beforeAutospacing="1" w:after="100" w:afterAutospacing="1" w:line="240" w:lineRule="auto"/>
+        <w:jc w:val="both"/>
+        <w:rPr>
+          <w:rFonts w:ascii="Candara" w:eastAsia="Times New Roman" w:hAnsi="Candara" w:cs="Times New Roman"/>
+          <w:sz w:val="24"/>
+          <w:szCs w:val="24"/>
+          <w:lang w:eastAsia="es-CO"/>
+        </w:rPr>
+      </w:pPr>
+      <w:r>
+        <w:rPr>
+          <w:rFonts w:ascii="Candara" w:eastAsia="Times New Roman" w:hAnsi="Candara" w:cs="Times New Roman"/>
+          <w:sz w:val="24"/>
+          <w:szCs w:val="24"/>
+          <w:lang w:eastAsia="es-CO"/>
+        </w:rPr>
+        <w:t>Los tres países con el mejor indicador para 2024 son , Canadá con un valor de 0.096, seguido de Alemania con un indicador de 0.082 y por último España con un valor de 0.069.</w:t>
+      </w:r>
     </w:p>
     <w:p>
       <w:pPr>
@@ -1010,6 +1467,7 @@
           <w:szCs w:val="24"/>
           <w:lang w:eastAsia="es-CO"/>
         </w:rPr>
+        <w:lastRenderedPageBreak/>
         <w:t>Agrupación de datos</w:t>
       </w:r>
       <w:r>
@@ -1064,7 +1522,6 @@
           <w:szCs w:val="24"/>
           <w:lang w:eastAsia="es-CO"/>
         </w:rPr>
-        <w:lastRenderedPageBreak/>
         <w:t>Cálculo de variaciones</w:t>
       </w:r>
       <w:r>
@@ -1450,8 +1907,8 @@
       </w:pPr>
     </w:p>
     <w:sectPr>
-      <w:headerReference w:type="default" r:id="rId7"/>
-      <w:footerReference w:type="default" r:id="rId8"/>
+      <w:headerReference w:type="default" r:id="rId12"/>
+      <w:footerReference w:type="default" r:id="rId13"/>
       <w:pgSz w:w="12240" w:h="15840"/>
       <w:pgMar w:top="1418" w:right="1418" w:bottom="1418" w:left="1418" w:header="709" w:footer="567" w:gutter="0"/>
       <w:cols w:space="708"/>
@@ -1633,6 +2090,7 @@
             </w:rPr>
             <w:t xml:space="preserve">Minería de Datos en </w:t>
           </w:r>
+          <w:proofErr w:type="spellStart"/>
           <w:r>
             <w:rPr>
               <w:rFonts w:ascii="Candara" w:hAnsi="Candara"/>
@@ -1641,6 +2099,7 @@
             </w:rPr>
             <w:t>Knime</w:t>
           </w:r>
+          <w:proofErr w:type="spellEnd"/>
         </w:p>
       </w:tc>
       <w:tc>

</xml_diff>